<commit_message>
Repaso Mid-term Nivel 1: toda la Guia de Estudio en el PPT (33 laminas) + guia corregida
- Nuevas laminas: alfabeto completo (21 vocales, 19 consonantes, batchim 7 sonidos), 4 niveles de formalidad,
  contadores y hora, 있어요/없어요, maquina de conjugar paso a paso, bonus clase 10, "Practica tu" por capitulo,
  respuestas y checklist final (con notas del profe)
- QA visual y de cobertura (4 agentes): regla del doble batchim corregida (읽어요 / 읽다), romanizacion 부엌에 [bu-o-ke],
  sin emoji rojo, tamanos legibles en proyector, ejemplos de 은/는 claros
- Guia de Estudio: mismas correcciones (docx + pdf)

Co-Authored-By: Claude Opus 5 <noreply@anthropic.com>
</commit_message>
<xml_diff>
--- a/A1_Nivel_1/Guia_Estudio_MidTerm_A1.docx
+++ b/A1_Nivel_1/Guia_Estudio_MidTerm_A1.docx
@@ -4018,7 +4018,7 @@
                 <w:sz w:val="20"/>
                 <w:szCs w:val="20"/>
               </w:rPr>
-              <w:t xml:space="preserve">📌 LA REGLA:  </w:t>
+              <w:t xml:space="preserve">🔷 LA REGLA:  </w:t>
             </w:r>
             <w:r>
               <w:rPr>
@@ -4027,7 +4027,7 @@
                 <w:sz w:val="21"/>
                 <w:szCs w:val="21"/>
               </w:rPr>
-              <w:t xml:space="preserve">Doble batchim como ㄺ → se lee el primero: </w:t>
+              <w:t xml:space="preserve">Doble batchim ㄺ (nota de la clase 10): antes de vocal suenan los dos, el ㄱ salta a la sílaba siguiente → </w:t>
             </w:r>
             <w:r>
               <w:rPr>
@@ -4038,7 +4038,7 @@
                 <w:sz w:val="21"/>
                 <w:szCs w:val="21"/>
               </w:rPr>
-              <w:t xml:space="preserve">읽어요 se dice [il-go-io]</w:t>
+              <w:t xml:space="preserve">읽어요 [il-go-io]</w:t>
             </w:r>
             <w:r>
               <w:rPr>
@@ -4047,7 +4047,27 @@
                 <w:sz w:val="21"/>
                 <w:szCs w:val="21"/>
               </w:rPr>
-              <w:t xml:space="preserve"> (nota de la clase 10).</w:t>
+              <w:t xml:space="preserve">; al final o antes de consonante suena solo el ㄱ → </w:t>
+            </w:r>
+            <w:r>
+              <w:rPr>
+                <w:rFonts w:ascii="Arial" w:cs="Arial" w:eastAsia="Arial" w:hAnsi="Arial"/>
+                <w:b/>
+                <w:bCs/>
+                <w:color w:val="1B1C24"/>
+                <w:sz w:val="21"/>
+                <w:szCs w:val="21"/>
+              </w:rPr>
+              <w:t xml:space="preserve">읽다 [ik-ta] · 닭 [dak]</w:t>
+            </w:r>
+            <w:r>
+              <w:rPr>
+                <w:rFonts w:ascii="Arial" w:cs="Arial" w:eastAsia="Arial" w:hAnsi="Arial"/>
+                <w:color w:val="1B1C24"/>
+                <w:sz w:val="21"/>
+                <w:szCs w:val="21"/>
+              </w:rPr>
+              <w:t xml:space="preserve">.</w:t>
             </w:r>
           </w:p>
         </w:tc>
@@ -4342,7 +4362,7 @@
                 <w:sz w:val="20"/>
                 <w:szCs w:val="20"/>
               </w:rPr>
-              <w:t xml:space="preserve">📌 LA REGLA:  </w:t>
+              <w:t xml:space="preserve">🔷 LA REGLA:  </w:t>
             </w:r>
             <w:r>
               <w:rPr>
@@ -5185,7 +5205,7 @@
                 <w:sz w:val="20"/>
                 <w:szCs w:val="20"/>
               </w:rPr>
-              <w:t xml:space="preserve">📌 LA REGLA:  </w:t>
+              <w:t xml:space="preserve">🔷 LA REGLA:  </w:t>
             </w:r>
             <w:r>
               <w:rPr>
@@ -6164,7 +6184,7 @@
                 <w:sz w:val="20"/>
                 <w:szCs w:val="20"/>
               </w:rPr>
-              <w:t xml:space="preserve">📌 LA REGLA:  </w:t>
+              <w:t xml:space="preserve">🔷 LA REGLA:  </w:t>
             </w:r>
             <w:r>
               <w:rPr>
@@ -8080,7 +8100,7 @@
                 <w:sz w:val="20"/>
                 <w:szCs w:val="20"/>
               </w:rPr>
-              <w:t xml:space="preserve">📌 LA REGLA:  </w:t>
+              <w:t xml:space="preserve">🔷 LA REGLA:  </w:t>
             </w:r>
             <w:r>
               <w:rPr>
@@ -9603,7 +9623,7 @@
           <w:sz w:val="19"/>
           <w:szCs w:val="19"/>
         </w:rPr>
-        <w:t xml:space="preserve">   [bu-o-gue u-iu-ga op-so-io]</w:t>
+        <w:t xml:space="preserve">   [bu-o-ke u-iu-ga op-so-io]</w:t>
       </w:r>
       <w:r>
         <w:rPr>
@@ -9657,7 +9677,7 @@
                 <w:sz w:val="20"/>
                 <w:szCs w:val="20"/>
               </w:rPr>
-              <w:t xml:space="preserve">📌 LA REGLA:  </w:t>
+              <w:t xml:space="preserve">🔷 LA REGLA:  </w:t>
             </w:r>
             <w:r>
               <w:rPr>
@@ -10075,7 +10095,7 @@
                 <w:sz w:val="20"/>
                 <w:szCs w:val="20"/>
               </w:rPr>
-              <w:t xml:space="preserve">📌 LA REGLA:  </w:t>
+              <w:t xml:space="preserve">🔷 LA REGLA:  </w:t>
             </w:r>
             <w:r>
               <w:rPr>
@@ -10428,7 +10448,7 @@
                 <w:sz w:val="20"/>
                 <w:szCs w:val="20"/>
               </w:rPr>
-              <w:t xml:space="preserve">📌 LA REGLA:  </w:t>
+              <w:t xml:space="preserve">🔷 LA REGLA:  </w:t>
             </w:r>
             <w:r>
               <w:rPr>
@@ -11935,7 +11955,7 @@
                 <w:sz w:val="20"/>
                 <w:szCs w:val="20"/>
               </w:rPr>
-              <w:t xml:space="preserve">📌 LA REGLA:  </w:t>
+              <w:t xml:space="preserve">🔷 LA REGLA:  </w:t>
             </w:r>
             <w:r>
               <w:rPr>

</xml_diff>